<commit_message>
Complete Module 2 Assignment
</commit_message>
<xml_diff>
--- a/Module-1/Richman_Module1.3_screenshots.docx..docx
+++ b/Module-1/Richman_Module1.3_screenshots.docx..docx
@@ -58,6 +58,46 @@
       <w:pPr>
         <w:rPr>
           <w:rFonts w:ascii="Times New Roman" w:hAnsi="Times New Roman" w:cs="Times New Roman"/>
+        </w:rPr>
+      </w:pPr>
+    </w:p>
+    <w:p>
+      <w:pPr>
+        <w:rPr>
+          <w:rFonts w:ascii="Times New Roman" w:hAnsi="Times New Roman" w:cs="Times New Roman"/>
+          <w:u w:val="single"/>
+        </w:rPr>
+      </w:pPr>
+      <w:r>
+        <w:rPr>
+          <w:rFonts w:ascii="Times New Roman" w:hAnsi="Times New Roman" w:cs="Times New Roman"/>
+          <w:u w:val="single"/>
+        </w:rPr>
+        <w:t>GitHub Repository Link</w:t>
+      </w:r>
+    </w:p>
+    <w:p>
+      <w:pPr>
+        <w:rPr>
+          <w:rFonts w:ascii="Times New Roman" w:hAnsi="Times New Roman" w:cs="Times New Roman"/>
+          <w:u w:val="single"/>
+        </w:rPr>
+      </w:pPr>
+      <w:hyperlink r:id="rId4" w:history="1">
+        <w:r>
+          <w:rPr>
+            <w:rStyle w:val="Hyperlink"/>
+            <w:rFonts w:ascii="Times New Roman" w:hAnsi="Times New Roman" w:cs="Times New Roman"/>
+          </w:rPr>
+          <w:t>https://github.com/Guitarjake15/csd-340</w:t>
+        </w:r>
+      </w:hyperlink>
+    </w:p>
+    <w:p>
+      <w:pPr>
+        <w:rPr>
+          <w:rFonts w:ascii="Times New Roman" w:hAnsi="Times New Roman" w:cs="Times New Roman"/>
+          <w:u w:val="single"/>
         </w:rPr>
       </w:pPr>
     </w:p>
@@ -101,7 +141,7 @@
                     <pic:cNvPicPr/>
                   </pic:nvPicPr>
                   <pic:blipFill>
-                    <a:blip r:embed="rId4" cstate="print">
+                    <a:blip r:embed="rId5" cstate="print">
                       <a:extLst>
                         <a:ext uri="{28A0092B-C50C-407E-A947-70E740481C1C}">
                           <a14:useLocalDpi xmlns:a14="http://schemas.microsoft.com/office/drawing/2010/main" val="0"/>
@@ -168,7 +208,7 @@
                     <pic:cNvPicPr/>
                   </pic:nvPicPr>
                   <pic:blipFill>
-                    <a:blip r:embed="rId5" cstate="print">
+                    <a:blip r:embed="rId6" cstate="print">
                       <a:extLst>
                         <a:ext uri="{28A0092B-C50C-407E-A947-70E740481C1C}">
                           <a14:useLocalDpi xmlns:a14="http://schemas.microsoft.com/office/drawing/2010/main" val="0"/>
@@ -183,6 +223,61 @@
                     <a:xfrm>
                       <a:off x="0" y="0"/>
                       <a:ext cx="5943600" cy="2642235"/>
+                    </a:xfrm>
+                    <a:prstGeom prst="rect">
+                      <a:avLst/>
+                    </a:prstGeom>
+                  </pic:spPr>
+                </pic:pic>
+              </a:graphicData>
+            </a:graphic>
+          </wp:inline>
+        </w:drawing>
+      </w:r>
+    </w:p>
+    <w:p>
+      <w:pPr>
+        <w:rPr>
+          <w:rFonts w:ascii="Times New Roman" w:hAnsi="Times New Roman" w:cs="Times New Roman"/>
+        </w:rPr>
+      </w:pPr>
+      <w:r>
+        <w:rPr>
+          <w:rFonts w:ascii="Times New Roman" w:hAnsi="Times New Roman" w:cs="Times New Roman"/>
+          <w:noProof/>
+        </w:rPr>
+        <w:lastRenderedPageBreak/>
+        <w:drawing>
+          <wp:inline distT="0" distB="0" distL="0" distR="0" wp14:anchorId="0C01D12F" wp14:editId="4EB07065">
+            <wp:extent cx="5943600" cy="1386205"/>
+            <wp:effectExtent l="0" t="0" r="0" b="0"/>
+            <wp:docPr id="168237393" name="Picture 1"/>
+            <wp:cNvGraphicFramePr>
+              <a:graphicFrameLocks xmlns:a="http://schemas.openxmlformats.org/drawingml/2006/main" noChangeAspect="1"/>
+            </wp:cNvGraphicFramePr>
+            <a:graphic xmlns:a="http://schemas.openxmlformats.org/drawingml/2006/main">
+              <a:graphicData uri="http://schemas.openxmlformats.org/drawingml/2006/picture">
+                <pic:pic xmlns:pic="http://schemas.openxmlformats.org/drawingml/2006/picture">
+                  <pic:nvPicPr>
+                    <pic:cNvPr id="168237393" name="Picture 168237393"/>
+                    <pic:cNvPicPr/>
+                  </pic:nvPicPr>
+                  <pic:blipFill>
+                    <a:blip r:embed="rId7" cstate="print">
+                      <a:extLst>
+                        <a:ext uri="{28A0092B-C50C-407E-A947-70E740481C1C}">
+                          <a14:useLocalDpi xmlns:a14="http://schemas.microsoft.com/office/drawing/2010/main" val="0"/>
+                        </a:ext>
+                      </a:extLst>
+                    </a:blip>
+                    <a:stretch>
+                      <a:fillRect/>
+                    </a:stretch>
+                  </pic:blipFill>
+                  <pic:spPr>
+                    <a:xfrm>
+                      <a:off x="0" y="0"/>
+                      <a:ext cx="5943600" cy="1386205"/>
                     </a:xfrm>
                     <a:prstGeom prst="rect">
                       <a:avLst/>
@@ -1122,6 +1217,29 @@
       <w:spacing w:val="5"/>
     </w:rPr>
   </w:style>
+  <w:style w:type="character" w:styleId="Hyperlink">
+    <w:name w:val="Hyperlink"/>
+    <w:basedOn w:val="DefaultParagraphFont"/>
+    <w:uiPriority w:val="99"/>
+    <w:unhideWhenUsed/>
+    <w:rsid w:val="00A34466"/>
+    <w:rPr>
+      <w:color w:val="467886" w:themeColor="hyperlink"/>
+      <w:u w:val="single"/>
+    </w:rPr>
+  </w:style>
+  <w:style w:type="character" w:styleId="UnresolvedMention">
+    <w:name w:val="Unresolved Mention"/>
+    <w:basedOn w:val="DefaultParagraphFont"/>
+    <w:uiPriority w:val="99"/>
+    <w:semiHidden/>
+    <w:unhideWhenUsed/>
+    <w:rsid w:val="00A34466"/>
+    <w:rPr>
+      <w:color w:val="605E5C"/>
+      <w:shd w:val="clear" w:color="auto" w:fill="E1DFDD"/>
+    </w:rPr>
+  </w:style>
 </w:styles>
 </file>
 

</xml_diff>